<commit_message>
LP has been updated
</commit_message>
<xml_diff>
--- a/computer_science_msc_2026_junius.docx
+++ b/computer_science_msc_2026_junius.docx
@@ -539,6 +539,7 @@
           <w:color w:val="000000" w:themeColor="text1"/>
           <w:sz w:val="24"/>
           <w:szCs w:val="24"/>
+          <w:highlight w:val="green"/>
           <w:lang w:val="en-US"/>
         </w:rPr>
       </w:pPr>
@@ -551,7 +552,7 @@
           <w:color w:val="000000" w:themeColor="text1"/>
           <w:sz w:val="24"/>
           <w:szCs w:val="24"/>
-          <w:highlight w:val="cyan"/>
+          <w:highlight w:val="green"/>
           <w:lang w:val="en-US"/>
         </w:rPr>
         <w:t>Online</w:t>
@@ -565,7 +566,7 @@
           <w:color w:val="000000" w:themeColor="text1"/>
           <w:sz w:val="24"/>
           <w:szCs w:val="24"/>
-          <w:highlight w:val="cyan"/>
+          <w:highlight w:val="green"/>
           <w:lang w:val="en-US"/>
         </w:rPr>
         <w:t xml:space="preserve"> Algorithms</w:t>
@@ -587,7 +588,7 @@
           <w:color w:val="000000" w:themeColor="text1"/>
           <w:sz w:val="24"/>
           <w:szCs w:val="24"/>
-          <w:highlight w:val="yellow"/>
+          <w:highlight w:val="green"/>
           <w:lang w:val="en-US"/>
         </w:rPr>
       </w:pPr>
@@ -597,7 +598,7 @@
           <w:color w:val="000000" w:themeColor="text1"/>
           <w:sz w:val="24"/>
           <w:szCs w:val="24"/>
-          <w:highlight w:val="yellow"/>
+          <w:highlight w:val="green"/>
           <w:lang w:val="en-US"/>
         </w:rPr>
         <w:t>Basic concepts of competitiveness analysis. On-line paging and bin packing problems.</w:t>
@@ -619,7 +620,7 @@
           <w:color w:val="000000" w:themeColor="text1"/>
           <w:sz w:val="24"/>
           <w:szCs w:val="24"/>
-          <w:highlight w:val="yellow"/>
+          <w:highlight w:val="green"/>
           <w:lang w:val="en-US"/>
         </w:rPr>
       </w:pPr>
@@ -629,7 +630,7 @@
           <w:color w:val="000000" w:themeColor="text1"/>
           <w:sz w:val="24"/>
           <w:szCs w:val="24"/>
-          <w:highlight w:val="yellow"/>
+          <w:highlight w:val="green"/>
           <w:lang w:val="en-US"/>
         </w:rPr>
         <w:t>On-line scheduling and k-server problems.</w:t>
@@ -661,7 +662,7 @@
           <w:color w:val="000000" w:themeColor="text1"/>
           <w:sz w:val="24"/>
           <w:szCs w:val="24"/>
-          <w:highlight w:val="cyan"/>
+          <w:highlight w:val="green"/>
           <w:lang w:val="en-US"/>
         </w:rPr>
         <w:t>Machine Learning</w:t>
@@ -683,7 +684,7 @@
           <w:color w:val="000000" w:themeColor="text1"/>
           <w:sz w:val="24"/>
           <w:szCs w:val="24"/>
-          <w:highlight w:val="yellow"/>
+          <w:highlight w:val="green"/>
           <w:lang w:val="en-US"/>
         </w:rPr>
       </w:pPr>
@@ -693,7 +694,7 @@
           <w:color w:val="000000" w:themeColor="text1"/>
           <w:sz w:val="24"/>
           <w:szCs w:val="24"/>
-          <w:highlight w:val="yellow"/>
+          <w:highlight w:val="green"/>
           <w:lang w:val="en-US"/>
         </w:rPr>
         <w:t xml:space="preserve">The basic notions of machine learning: feature extraction, the curse of dimensionality, no free lunch theorem, </w:t>
@@ -704,7 +705,7 @@
           <w:color w:val="000000" w:themeColor="text1"/>
           <w:sz w:val="24"/>
           <w:szCs w:val="24"/>
-          <w:highlight w:val="yellow"/>
+          <w:highlight w:val="green"/>
           <w:lang w:val="en-US"/>
         </w:rPr>
         <w:t>Occam’s</w:t>
@@ -715,7 +716,7 @@
           <w:color w:val="000000" w:themeColor="text1"/>
           <w:sz w:val="24"/>
           <w:szCs w:val="24"/>
-          <w:highlight w:val="yellow"/>
+          <w:highlight w:val="green"/>
           <w:lang w:val="en-US"/>
         </w:rPr>
         <w:t xml:space="preserve"> razor, generalization and overfitting, measuring the training error.</w:t>
@@ -737,7 +738,7 @@
           <w:color w:val="000000" w:themeColor="text1"/>
           <w:sz w:val="24"/>
           <w:szCs w:val="24"/>
-          <w:highlight w:val="yellow"/>
+          <w:highlight w:val="green"/>
           <w:lang w:val="en-US"/>
         </w:rPr>
       </w:pPr>
@@ -747,7 +748,7 @@
           <w:color w:val="000000" w:themeColor="text1"/>
           <w:sz w:val="24"/>
           <w:szCs w:val="24"/>
-          <w:highlight w:val="yellow"/>
+          <w:highlight w:val="green"/>
           <w:lang w:val="en-US"/>
         </w:rPr>
         <w:t>Bayes decision theory and the relates concepts. The maximum likelihood parameter estimation method for Gaussian curves and for Gaussian Mixture Models.</w:t>
@@ -769,7 +770,7 @@
           <w:color w:val="000000" w:themeColor="text1"/>
           <w:sz w:val="24"/>
           <w:szCs w:val="24"/>
-          <w:highlight w:val="yellow"/>
+          <w:highlight w:val="green"/>
           <w:lang w:val="en-US"/>
         </w:rPr>
       </w:pPr>
@@ -779,7 +780,7 @@
           <w:color w:val="000000" w:themeColor="text1"/>
           <w:sz w:val="24"/>
           <w:szCs w:val="24"/>
-          <w:highlight w:val="yellow"/>
+          <w:highlight w:val="green"/>
           <w:lang w:val="en-US"/>
         </w:rPr>
         <w:t>Supervised learning methods (neural nets, support vector machines, decision trees)</w:t>
@@ -811,6 +812,7 @@
           <w:color w:val="000000" w:themeColor="text1"/>
           <w:sz w:val="24"/>
           <w:szCs w:val="24"/>
+          <w:highlight w:val="cyan"/>
           <w:lang w:val="en-US"/>
         </w:rPr>
         <w:t>Advanced Approximate and Symbolic Computations</w:t>
@@ -4074,10 +4076,14 @@
     <w:rsid w:val="0064112F"/>
     <w:rsid w:val="006F4E39"/>
     <w:rsid w:val="00706828"/>
+    <w:rsid w:val="00707B27"/>
     <w:rsid w:val="008309B7"/>
+    <w:rsid w:val="00846525"/>
     <w:rsid w:val="00863E70"/>
     <w:rsid w:val="008D66DC"/>
     <w:rsid w:val="00910A1B"/>
+    <w:rsid w:val="009C1FD0"/>
+    <w:rsid w:val="009C2F52"/>
     <w:rsid w:val="00A219EF"/>
     <w:rsid w:val="00A515DD"/>
     <w:rsid w:val="00AF11A7"/>
@@ -4087,6 +4093,7 @@
     <w:rsid w:val="00C91D46"/>
     <w:rsid w:val="00CD06F8"/>
     <w:rsid w:val="00CE22A0"/>
+    <w:rsid w:val="00CE2A4A"/>
     <w:rsid w:val="00D17EE4"/>
     <w:rsid w:val="00D621A3"/>
     <w:rsid w:val="00DA61DE"/>
@@ -4095,6 +4102,7 @@
     <w:rsid w:val="00E234CC"/>
     <w:rsid w:val="00E23F4F"/>
     <w:rsid w:val="00E32631"/>
+    <w:rsid w:val="00E46E50"/>
     <w:rsid w:val="00F2305D"/>
     <w:rsid w:val="00F36063"/>
     <w:rsid w:val="00F61F75"/>

</xml_diff>

<commit_message>
LP has been updated once again
</commit_message>
<xml_diff>
--- a/computer_science_msc_2026_junius.docx
+++ b/computer_science_msc_2026_junius.docx
@@ -283,6 +283,7 @@
           <w:color w:val="000000" w:themeColor="text1"/>
           <w:sz w:val="24"/>
           <w:szCs w:val="24"/>
+          <w:highlight w:val="green"/>
           <w:lang w:val="en-US"/>
         </w:rPr>
       </w:pPr>
@@ -295,7 +296,7 @@
           <w:color w:val="000000" w:themeColor="text1"/>
           <w:sz w:val="24"/>
           <w:szCs w:val="24"/>
-          <w:highlight w:val="cyan"/>
+          <w:highlight w:val="green"/>
           <w:lang w:val="en-US"/>
         </w:rPr>
         <w:t>Application of Linear Programming</w:t>
@@ -317,7 +318,7 @@
           <w:color w:val="000000" w:themeColor="text1"/>
           <w:sz w:val="24"/>
           <w:szCs w:val="24"/>
-          <w:highlight w:val="yellow"/>
+          <w:highlight w:val="green"/>
           <w:lang w:val="en-US"/>
         </w:rPr>
       </w:pPr>
@@ -327,7 +328,7 @@
           <w:color w:val="000000" w:themeColor="text1"/>
           <w:sz w:val="24"/>
           <w:szCs w:val="24"/>
-          <w:highlight w:val="yellow"/>
+          <w:highlight w:val="green"/>
           <w:lang w:val="en-US"/>
         </w:rPr>
         <w:t>Duality, dual simplex algorithm. Integer programming.</w:t>
@@ -349,7 +350,7 @@
           <w:color w:val="000000" w:themeColor="text1"/>
           <w:sz w:val="24"/>
           <w:szCs w:val="24"/>
-          <w:highlight w:val="yellow"/>
+          <w:highlight w:val="green"/>
           <w:lang w:val="en-US"/>
         </w:rPr>
       </w:pPr>
@@ -359,7 +360,7 @@
           <w:color w:val="000000" w:themeColor="text1"/>
           <w:sz w:val="24"/>
           <w:szCs w:val="24"/>
-          <w:highlight w:val="yellow"/>
+          <w:highlight w:val="green"/>
           <w:lang w:val="en-US"/>
         </w:rPr>
         <w:t>Assignment and transportation problem.</w:t>
@@ -4063,6 +4064,7 @@
     <w:rsid w:val="00044895"/>
     <w:rsid w:val="00071DEA"/>
     <w:rsid w:val="000A3CA3"/>
+    <w:rsid w:val="001A37B6"/>
     <w:rsid w:val="001B094F"/>
     <w:rsid w:val="001F5F70"/>
     <w:rsid w:val="002973A9"/>
@@ -4073,6 +4075,7 @@
     <w:rsid w:val="004E1309"/>
     <w:rsid w:val="00527DE6"/>
     <w:rsid w:val="005632A1"/>
+    <w:rsid w:val="00622A85"/>
     <w:rsid w:val="0064112F"/>
     <w:rsid w:val="006F4E39"/>
     <w:rsid w:val="00706828"/>

</xml_diff>